<commit_message>
docs(sprint4): 'três configurações de modelo' em vez de 'três modelos'
Co-Authored-By: Claude Opus 5.5 <noreply@anthropic.com>
</commit_message>
<xml_diff>
--- a/docs/sprint4/Sprint4-Claro-Omnichannel.docx
+++ b/docs/sprint4/Sprint4-Claro-Omnichannel.docx
@@ -75,7 +75,7 @@
         </w:rPr>
         <w:t xml:space="preserve">Repositório: </w:t>
       </w:r>
-      <w:hyperlink w:history="1" r:id="rIdpt1jfc9vywbtljawdb8ya">
+      <w:hyperlink w:history="1" r:id="rIdblpsn3peprh4_lv-iy8ux">
         <w:r>
           <w:rPr>
             <w:rStyle w:val="Hyperlink"/>
@@ -2076,7 +2076,7 @@
         <w:spacing w:after="120"/>
       </w:pPr>
       <w:r>
-        <w:t xml:space="preserve">Foram comparados três modelos em cenários reais (fatura, internet, pedido de humano e contestação). O escolhido acertou 4 de 4; um modelo mais rápido acertou 0 de 4 por prometer ações sem executá-las.</w:t>
+        <w:t xml:space="preserve">Foram comparadas três configurações de modelo em cenários reais (fatura, internet, pedido de humano e contestação). A escolhida acertou 4 de 4; um modelo mais rápido acertou 0 de 4 por prometer ações sem executá-las.</w:t>
       </w:r>
     </w:p>
     <w:p>

</xml_diff>

<commit_message>
docs(sprint4): documento final com o link do vídeo e a equipe
Co-Authored-By: Claude Opus 5.5 <noreply@anthropic.com>
</commit_message>
<xml_diff>
--- a/docs/sprint4/Sprint4-Claro-Omnichannel.docx
+++ b/docs/sprint4/Sprint4-Claro-Omnichannel.docx
@@ -55,14 +55,14 @@
         </w:rPr>
         <w:t xml:space="preserve">Vídeo de demonstração: </w:t>
       </w:r>
-      <w:r>
-        <w:rPr>
-          <w:b/>
-          <w:bCs/>
-          <w:highlight w:val="yellow"/>
-        </w:rPr>
-        <w:t xml:space="preserve">[COLE AQUI O LINK PÚBLICO DO VÍDEO]</w:t>
-      </w:r>
+      <w:hyperlink w:history="1" r:id="rIdfjnzmslatbiyt2pjne49l">
+        <w:r>
+          <w:rPr>
+            <w:rStyle w:val="Hyperlink"/>
+          </w:rPr>
+          <w:t xml:space="preserve">https://youtu.be/I5VV5J252EU</w:t>
+        </w:r>
+      </w:hyperlink>
     </w:p>
     <w:p>
       <w:pPr>
@@ -75,7 +75,7 @@
         </w:rPr>
         <w:t xml:space="preserve">Repositório: </w:t>
       </w:r>
-      <w:hyperlink w:history="1" r:id="rIdblpsn3peprh4_lv-iy8ux">
+      <w:hyperlink w:history="1" r:id="rIdkooq_nksvwtxqiiwjothg">
         <w:r>
           <w:rPr>
             <w:rStyle w:val="Hyperlink"/>
@@ -106,7 +106,20 @@
         <w:spacing w:after="60"/>
       </w:pPr>
       <w:r>
-        <w:t xml:space="preserve">[Nome completo] — RM [00000]</w:t>
+        <w:t xml:space="preserve">Matheus Cerqueira — RM 99996</w:t>
+      </w:r>
+    </w:p>
+    <w:p>
+      <w:pPr>
+        <w:pStyle w:val="ListParagraph"/>
+        <w:numPr>
+          <w:ilvl w:val="0"/>
+          <w:numId w:val="2"/>
+        </w:numPr>
+        <w:spacing w:after="60"/>
+      </w:pPr>
+      <w:r>
+        <w:t xml:space="preserve">Gabriel Fernando Gimenez — RM 92957</w:t>
       </w:r>
     </w:p>
     <w:p>
@@ -1127,94 +1140,6 @@
                           </pic:cNvPicPr>
                         </pic:nvPicPr>
                         <pic:blipFill>
-                          <a:blip r:embed="rId9" cstate="none"/>
-                          <a:srcRect/>
-                          <a:stretch>
-                            <a:fillRect/>
-                          </a:stretch>
-                        </pic:blipFill>
-                        <pic:spPr bwMode="auto">
-                          <a:xfrm>
-                            <a:off x="0" y="0"/>
-                            <a:ext cx="2000250" cy="4191000"/>
-                          </a:xfrm>
-                          <a:prstGeom prst="rect">
-                            <a:avLst/>
-                          </a:prstGeom>
-                        </pic:spPr>
-                      </pic:pic>
-                    </a:graphicData>
-                  </a:graphic>
-                </wp:inline>
-              </w:drawing>
-            </w:r>
-          </w:p>
-          <w:p>
-            <w:pPr>
-              <w:spacing w:after="120" w:before="40"/>
-              <w:jc w:val="center"/>
-            </w:pPr>
-            <w:r>
-              <w:rPr>
-                <w:i/>
-                <w:iCs/>
-                <w:color w:val="6B7280"/>
-                <w:sz w:val="18"/>
-                <w:szCs w:val="18"/>
-              </w:rPr>
-              <w:t xml:space="preserve">Novo chamado com canais que não existiam</w:t>
-            </w:r>
-          </w:p>
-        </w:tc>
-        <w:tc>
-          <w:tcPr>
-            <w:tcW w:type="dxa" w:w="4819"/>
-            <w:tcBorders>
-              <w:top w:val="none" w:color="FFFFFF" w:sz="0"/>
-              <w:left w:val="none" w:color="FFFFFF" w:sz="0"/>
-              <w:bottom w:val="none" w:color="FFFFFF" w:sz="0"/>
-              <w:right w:val="none" w:color="FFFFFF" w:sz="0"/>
-            </w:tcBorders>
-            <w:vAlign w:val="top"/>
-          </w:tcPr>
-          <w:p>
-            <w:pPr>
-              <w:spacing w:after="80"/>
-              <w:jc w:val="center"/>
-            </w:pPr>
-            <w:r>
-              <w:rPr>
-                <w:b/>
-                <w:bCs/>
-                <w:color w:val="FFFFFF"/>
-                <w:shd w:fill="15803D" w:color="auto" w:val="clear"/>
-              </w:rPr>
-              <w:t xml:space="preserve"> DEPOIS </w:t>
-            </w:r>
-          </w:p>
-          <w:p>
-            <w:pPr>
-              <w:jc w:val="center"/>
-            </w:pPr>
-            <w:r>
-              <w:drawing>
-                <wp:inline distT="0" distB="0" distL="0" distR="0">
-                  <wp:extent cx="2000250" cy="4191000"/>
-                  <wp:effectExtent t="0" r="0" b="0" l="0"/>
-                  <wp:docPr id="2" name="depois-1-novo-chamado.png" descr="depois-1-novo-chamado.png" title="depois-1-novo-chamado.png"/>
-                  <wp:cNvGraphicFramePr>
-                    <a:graphicFrameLocks xmlns:a="http://schemas.openxmlformats.org/drawingml/2006/main" noChangeAspect="1"/>
-                  </wp:cNvGraphicFramePr>
-                  <a:graphic xmlns:a="http://schemas.openxmlformats.org/drawingml/2006/main">
-                    <a:graphicData uri="http://schemas.openxmlformats.org/drawingml/2006/picture">
-                      <pic:pic xmlns:pic="http://schemas.openxmlformats.org/drawingml/2006/picture">
-                        <pic:nvPicPr>
-                          <pic:cNvPr id="0" name="" descr=""/>
-                          <pic:cNvPicPr>
-                            <a:picLocks noChangeAspect="1" noChangeArrowheads="1"/>
-                          </pic:cNvPicPr>
-                        </pic:nvPicPr>
-                        <pic:blipFill>
                           <a:blip r:embed="rId10" cstate="none"/>
                           <a:srcRect/>
                           <a:stretch>
@@ -1250,6 +1175,94 @@
                 <w:sz w:val="18"/>
                 <w:szCs w:val="18"/>
               </w:rPr>
+              <w:t xml:space="preserve">Novo chamado com canais que não existiam</w:t>
+            </w:r>
+          </w:p>
+        </w:tc>
+        <w:tc>
+          <w:tcPr>
+            <w:tcW w:type="dxa" w:w="4819"/>
+            <w:tcBorders>
+              <w:top w:val="none" w:color="FFFFFF" w:sz="0"/>
+              <w:left w:val="none" w:color="FFFFFF" w:sz="0"/>
+              <w:bottom w:val="none" w:color="FFFFFF" w:sz="0"/>
+              <w:right w:val="none" w:color="FFFFFF" w:sz="0"/>
+            </w:tcBorders>
+            <w:vAlign w:val="top"/>
+          </w:tcPr>
+          <w:p>
+            <w:pPr>
+              <w:spacing w:after="80"/>
+              <w:jc w:val="center"/>
+            </w:pPr>
+            <w:r>
+              <w:rPr>
+                <w:b/>
+                <w:bCs/>
+                <w:color w:val="FFFFFF"/>
+                <w:shd w:fill="15803D" w:color="auto" w:val="clear"/>
+              </w:rPr>
+              <w:t xml:space="preserve"> DEPOIS </w:t>
+            </w:r>
+          </w:p>
+          <w:p>
+            <w:pPr>
+              <w:jc w:val="center"/>
+            </w:pPr>
+            <w:r>
+              <w:drawing>
+                <wp:inline distT="0" distB="0" distL="0" distR="0">
+                  <wp:extent cx="2000250" cy="4191000"/>
+                  <wp:effectExtent t="0" r="0" b="0" l="0"/>
+                  <wp:docPr id="2" name="depois-1-novo-chamado.png" descr="depois-1-novo-chamado.png" title="depois-1-novo-chamado.png"/>
+                  <wp:cNvGraphicFramePr>
+                    <a:graphicFrameLocks xmlns:a="http://schemas.openxmlformats.org/drawingml/2006/main" noChangeAspect="1"/>
+                  </wp:cNvGraphicFramePr>
+                  <a:graphic xmlns:a="http://schemas.openxmlformats.org/drawingml/2006/main">
+                    <a:graphicData uri="http://schemas.openxmlformats.org/drawingml/2006/picture">
+                      <pic:pic xmlns:pic="http://schemas.openxmlformats.org/drawingml/2006/picture">
+                        <pic:nvPicPr>
+                          <pic:cNvPr id="0" name="" descr=""/>
+                          <pic:cNvPicPr>
+                            <a:picLocks noChangeAspect="1" noChangeArrowheads="1"/>
+                          </pic:cNvPicPr>
+                        </pic:nvPicPr>
+                        <pic:blipFill>
+                          <a:blip r:embed="rId11" cstate="none"/>
+                          <a:srcRect/>
+                          <a:stretch>
+                            <a:fillRect/>
+                          </a:stretch>
+                        </pic:blipFill>
+                        <pic:spPr bwMode="auto">
+                          <a:xfrm>
+                            <a:off x="0" y="0"/>
+                            <a:ext cx="2000250" cy="4191000"/>
+                          </a:xfrm>
+                          <a:prstGeom prst="rect">
+                            <a:avLst/>
+                          </a:prstGeom>
+                        </pic:spPr>
+                      </pic:pic>
+                    </a:graphicData>
+                  </a:graphic>
+                </wp:inline>
+              </w:drawing>
+            </w:r>
+          </w:p>
+          <w:p>
+            <w:pPr>
+              <w:spacing w:after="120" w:before="40"/>
+              <w:jc w:val="center"/>
+            </w:pPr>
+            <w:r>
+              <w:rPr>
+                <w:i/>
+                <w:iCs/>
+                <w:color w:val="6B7280"/>
+                <w:sz w:val="18"/>
+                <w:szCs w:val="18"/>
+              </w:rPr>
               <w:t xml:space="preserve">Novo chamado sem canais fictícios</w:t>
             </w:r>
           </w:p>
@@ -1296,7 +1309,7 @@
                     </pic:cNvPicPr>
                   </pic:nvPicPr>
                   <pic:blipFill>
-                    <a:blip r:embed="rId11" cstate="none"/>
+                    <a:blip r:embed="rId12" cstate="none"/>
                     <a:srcRect/>
                     <a:stretch>
                       <a:fillRect/>
@@ -1403,7 +1416,7 @@
                           </pic:cNvPicPr>
                         </pic:nvPicPr>
                         <pic:blipFill>
-                          <a:blip r:embed="rId12" cstate="none"/>
+                          <a:blip r:embed="rId13" cstate="none"/>
                           <a:srcRect/>
                           <a:stretch>
                             <a:fillRect/>
@@ -1476,7 +1489,7 @@
                           </pic:cNvPicPr>
                         </pic:nvPicPr>
                         <pic:blipFill>
-                          <a:blip r:embed="rId13" cstate="none"/>
+                          <a:blip r:embed="rId14" cstate="none"/>
                           <a:srcRect/>
                           <a:stretch>
                             <a:fillRect/>
@@ -1684,7 +1697,7 @@
                     </pic:cNvPicPr>
                   </pic:nvPicPr>
                   <pic:blipFill>
-                    <a:blip r:embed="rId11" cstate="none"/>
+                    <a:blip r:embed="rId12" cstate="none"/>
                     <a:srcRect/>
                     <a:stretch>
                       <a:fillRect/>
@@ -1734,84 +1747,6 @@
             <wp:extent cx="4781550" cy="2857500"/>
             <wp:effectExtent t="0" r="0" b="0" l="0"/>
             <wp:docPr id="7" name="antes-2-painel-apos-recarregar.png" descr="antes-2-painel-apos-recarregar.png" title="antes-2-painel-apos-recarregar.png"/>
-            <wp:cNvGraphicFramePr>
-              <a:graphicFrameLocks xmlns:a="http://schemas.openxmlformats.org/drawingml/2006/main" noChangeAspect="1"/>
-            </wp:cNvGraphicFramePr>
-            <a:graphic xmlns:a="http://schemas.openxmlformats.org/drawingml/2006/main">
-              <a:graphicData uri="http://schemas.openxmlformats.org/drawingml/2006/picture">
-                <pic:pic xmlns:pic="http://schemas.openxmlformats.org/drawingml/2006/picture">
-                  <pic:nvPicPr>
-                    <pic:cNvPr id="0" name="" descr=""/>
-                    <pic:cNvPicPr>
-                      <a:picLocks noChangeAspect="1" noChangeArrowheads="1"/>
-                    </pic:cNvPicPr>
-                  </pic:nvPicPr>
-                  <pic:blipFill>
-                    <a:blip r:embed="rId14" cstate="none"/>
-                    <a:srcRect/>
-                    <a:stretch>
-                      <a:fillRect/>
-                    </a:stretch>
-                  </pic:blipFill>
-                  <pic:spPr bwMode="auto">
-                    <a:xfrm>
-                      <a:off x="0" y="0"/>
-                      <a:ext cx="4781550" cy="2857500"/>
-                    </a:xfrm>
-                    <a:prstGeom prst="rect">
-                      <a:avLst/>
-                    </a:prstGeom>
-                  </pic:spPr>
-                </pic:pic>
-              </a:graphicData>
-            </a:graphic>
-          </wp:inline>
-        </w:drawing>
-      </w:r>
-    </w:p>
-    <w:p>
-      <w:pPr>
-        <w:spacing w:after="160"/>
-        <w:jc w:val="center"/>
-      </w:pPr>
-      <w:r>
-        <w:rPr>
-          <w:i/>
-          <w:iCs/>
-          <w:color w:val="6B7280"/>
-          <w:sz w:val="18"/>
-          <w:szCs w:val="18"/>
-        </w:rPr>
-        <w:t xml:space="preserve">…a mensagem só aparece depois de recarregar a página.</w:t>
-      </w:r>
-    </w:p>
-    <w:p>
-      <w:pPr>
-        <w:keepNext/>
-        <w:spacing w:after="80" w:before="160"/>
-      </w:pPr>
-      <w:r>
-        <w:rPr>
-          <w:b/>
-          <w:bCs/>
-          <w:color w:val="FFFFFF"/>
-          <w:shd w:fill="15803D" w:color="auto" w:val="clear"/>
-        </w:rPr>
-        <w:t xml:space="preserve"> DEPOIS </w:t>
-      </w:r>
-    </w:p>
-    <w:p>
-      <w:pPr>
-        <w:keepNext/>
-        <w:spacing w:after="40"/>
-        <w:jc w:val="center"/>
-      </w:pPr>
-      <w:r>
-        <w:drawing>
-          <wp:inline distT="0" distB="0" distL="0" distR="0">
-            <wp:extent cx="4781550" cy="2857500"/>
-            <wp:effectExtent t="0" r="0" b="0" l="0"/>
-            <wp:docPr id="8" name="depois-2-painel-tempo-real.png" descr="depois-2-painel-tempo-real.png" title="depois-2-painel-tempo-real.png"/>
             <wp:cNvGraphicFramePr>
               <a:graphicFrameLocks xmlns:a="http://schemas.openxmlformats.org/drawingml/2006/main" noChangeAspect="1"/>
             </wp:cNvGraphicFramePr>
@@ -1860,6 +1795,84 @@
           <w:sz w:val="18"/>
           <w:szCs w:val="18"/>
         </w:rPr>
+        <w:t xml:space="preserve">…a mensagem só aparece depois de recarregar a página.</w:t>
+      </w:r>
+    </w:p>
+    <w:p>
+      <w:pPr>
+        <w:keepNext/>
+        <w:spacing w:after="80" w:before="160"/>
+      </w:pPr>
+      <w:r>
+        <w:rPr>
+          <w:b/>
+          <w:bCs/>
+          <w:color w:val="FFFFFF"/>
+          <w:shd w:fill="15803D" w:color="auto" w:val="clear"/>
+        </w:rPr>
+        <w:t xml:space="preserve"> DEPOIS </w:t>
+      </w:r>
+    </w:p>
+    <w:p>
+      <w:pPr>
+        <w:keepNext/>
+        <w:spacing w:after="40"/>
+        <w:jc w:val="center"/>
+      </w:pPr>
+      <w:r>
+        <w:drawing>
+          <wp:inline distT="0" distB="0" distL="0" distR="0">
+            <wp:extent cx="4781550" cy="2857500"/>
+            <wp:effectExtent t="0" r="0" b="0" l="0"/>
+            <wp:docPr id="8" name="depois-2-painel-tempo-real.png" descr="depois-2-painel-tempo-real.png" title="depois-2-painel-tempo-real.png"/>
+            <wp:cNvGraphicFramePr>
+              <a:graphicFrameLocks xmlns:a="http://schemas.openxmlformats.org/drawingml/2006/main" noChangeAspect="1"/>
+            </wp:cNvGraphicFramePr>
+            <a:graphic xmlns:a="http://schemas.openxmlformats.org/drawingml/2006/main">
+              <a:graphicData uri="http://schemas.openxmlformats.org/drawingml/2006/picture">
+                <pic:pic xmlns:pic="http://schemas.openxmlformats.org/drawingml/2006/picture">
+                  <pic:nvPicPr>
+                    <pic:cNvPr id="0" name="" descr=""/>
+                    <pic:cNvPicPr>
+                      <a:picLocks noChangeAspect="1" noChangeArrowheads="1"/>
+                    </pic:cNvPicPr>
+                  </pic:nvPicPr>
+                  <pic:blipFill>
+                    <a:blip r:embed="rId16" cstate="none"/>
+                    <a:srcRect/>
+                    <a:stretch>
+                      <a:fillRect/>
+                    </a:stretch>
+                  </pic:blipFill>
+                  <pic:spPr bwMode="auto">
+                    <a:xfrm>
+                      <a:off x="0" y="0"/>
+                      <a:ext cx="4781550" cy="2857500"/>
+                    </a:xfrm>
+                    <a:prstGeom prst="rect">
+                      <a:avLst/>
+                    </a:prstGeom>
+                  </pic:spPr>
+                </pic:pic>
+              </a:graphicData>
+            </a:graphic>
+          </wp:inline>
+        </w:drawing>
+      </w:r>
+    </w:p>
+    <w:p>
+      <w:pPr>
+        <w:spacing w:after="160"/>
+        <w:jc w:val="center"/>
+      </w:pPr>
+      <w:r>
+        <w:rPr>
+          <w:i/>
+          <w:iCs/>
+          <w:color w:val="6B7280"/>
+          <w:sz w:val="18"/>
+          <w:szCs w:val="18"/>
+        </w:rPr>
         <w:t xml:space="preserve">A mesma mensagem aparece sozinha no painel, sem recarregar</w:t>
       </w:r>
     </w:p>
@@ -1888,7 +1901,7 @@
                     </pic:cNvPicPr>
                   </pic:nvPicPr>
                   <pic:blipFill>
-                    <a:blip r:embed="rId16" cstate="none"/>
+                    <a:blip r:embed="rId17" cstate="none"/>
                     <a:srcRect/>
                     <a:stretch>
                       <a:fillRect/>
@@ -2156,7 +2169,7 @@
                           </pic:cNvPicPr>
                         </pic:nvPicPr>
                         <pic:blipFill>
-                          <a:blip r:embed="rId17" cstate="none"/>
+                          <a:blip r:embed="rId18" cstate="none"/>
                           <a:srcRect/>
                           <a:stretch>
                             <a:fillRect/>
@@ -2229,7 +2242,7 @@
                           </pic:cNvPicPr>
                         </pic:nvPicPr>
                         <pic:blipFill>
-                          <a:blip r:embed="rId18" cstate="none"/>
+                          <a:blip r:embed="rId19" cstate="none"/>
                           <a:srcRect/>
                           <a:stretch>
                             <a:fillRect/>
@@ -2339,7 +2352,7 @@
                           </pic:cNvPicPr>
                         </pic:nvPicPr>
                         <pic:blipFill>
-                          <a:blip r:embed="rId19" cstate="none"/>
+                          <a:blip r:embed="rId20" cstate="none"/>
                           <a:srcRect/>
                           <a:stretch>
                             <a:fillRect/>
@@ -2412,7 +2425,7 @@
                           </pic:cNvPicPr>
                         </pic:nvPicPr>
                         <pic:blipFill>
-                          <a:blip r:embed="rId20" cstate="none"/>
+                          <a:blip r:embed="rId21" cstate="none"/>
                           <a:srcRect/>
                           <a:stretch>
                             <a:fillRect/>
@@ -2465,69 +2478,6 @@
             <wp:extent cx="5029200" cy="3143250"/>
             <wp:effectExtent t="0" r="0" b="0" l="0"/>
             <wp:docPr id="14" name="depois-3-painel-transferencia-ia.png" descr="depois-3-painel-transferencia-ia.png" title="depois-3-painel-transferencia-ia.png"/>
-            <wp:cNvGraphicFramePr>
-              <a:graphicFrameLocks xmlns:a="http://schemas.openxmlformats.org/drawingml/2006/main" noChangeAspect="1"/>
-            </wp:cNvGraphicFramePr>
-            <a:graphic xmlns:a="http://schemas.openxmlformats.org/drawingml/2006/main">
-              <a:graphicData uri="http://schemas.openxmlformats.org/drawingml/2006/picture">
-                <pic:pic xmlns:pic="http://schemas.openxmlformats.org/drawingml/2006/picture">
-                  <pic:nvPicPr>
-                    <pic:cNvPr id="0" name="" descr=""/>
-                    <pic:cNvPicPr>
-                      <a:picLocks noChangeAspect="1" noChangeArrowheads="1"/>
-                    </pic:cNvPicPr>
-                  </pic:nvPicPr>
-                  <pic:blipFill>
-                    <a:blip r:embed="rId21" cstate="none"/>
-                    <a:srcRect/>
-                    <a:stretch>
-                      <a:fillRect/>
-                    </a:stretch>
-                  </pic:blipFill>
-                  <pic:spPr bwMode="auto">
-                    <a:xfrm>
-                      <a:off x="0" y="0"/>
-                      <a:ext cx="5029200" cy="3143250"/>
-                    </a:xfrm>
-                    <a:prstGeom prst="rect">
-                      <a:avLst/>
-                    </a:prstGeom>
-                  </pic:spPr>
-                </pic:pic>
-              </a:graphicData>
-            </a:graphic>
-          </wp:inline>
-        </w:drawing>
-      </w:r>
-    </w:p>
-    <w:p>
-      <w:pPr>
-        <w:spacing w:after="160"/>
-        <w:jc w:val="center"/>
-      </w:pPr>
-      <w:r>
-        <w:rPr>
-          <w:i/>
-          <w:iCs/>
-          <w:color w:val="6B7280"/>
-          <w:sz w:val="18"/>
-          <w:szCs w:val="18"/>
-        </w:rPr>
-        <w:t xml:space="preserve">Painel: transferência feita pela IA, com motivo e resumo do caso para o atendente</w:t>
-      </w:r>
-    </w:p>
-    <w:p>
-      <w:pPr>
-        <w:keepNext/>
-        <w:spacing w:after="40"/>
-        <w:jc w:val="center"/>
-      </w:pPr>
-      <w:r>
-        <w:drawing>
-          <wp:inline distT="0" distB="0" distL="0" distR="0">
-            <wp:extent cx="5029200" cy="3143250"/>
-            <wp:effectExtent t="0" r="0" b="0" l="0"/>
-            <wp:docPr id="15" name="depois-3-dashboard-metricas-ia.png" descr="depois-3-dashboard-metricas-ia.png" title="depois-3-dashboard-metricas-ia.png"/>
             <wp:cNvGraphicFramePr>
               <a:graphicFrameLocks xmlns:a="http://schemas.openxmlformats.org/drawingml/2006/main" noChangeAspect="1"/>
             </wp:cNvGraphicFramePr>
@@ -2576,175 +2526,7 @@
           <w:sz w:val="18"/>
           <w:szCs w:val="18"/>
         </w:rPr>
-        <w:t xml:space="preserve">Dashboard: canais reais/mock, métricas da IA e selo "Transferido pela IA"</w:t>
-      </w:r>
-    </w:p>
-    <w:p>
-      <w:pPr>
-        <w:pStyle w:val="Heading1"/>
-        <w:pageBreakBefore/>
-      </w:pPr>
-      <w:r>
-        <w:t xml:space="preserve">Melhoria 4 — Segurança e LGPD</w:t>
-      </w:r>
-    </w:p>
-    <w:p>
-      <w:pPr>
-        <w:pStyle w:val="Heading2"/>
-      </w:pPr>
-      <w:r>
-        <w:t xml:space="preserve">Como estava (antes)</w:t>
-      </w:r>
-    </w:p>
-    <w:p>
-      <w:pPr>
-        <w:pStyle w:val="ListParagraph"/>
-        <w:numPr>
-          <w:ilvl w:val="0"/>
-          <w:numId w:val="2"/>
-        </w:numPr>
-        <w:spacing w:after="60"/>
-      </w:pPr>
-      <w:r>
-        <w:t xml:space="preserve">O cadastro público aceitava o campo de perfil: qualquer pessoa criava uma conta de ADMINISTRADOR (resposta 201).</w:t>
-      </w:r>
-    </w:p>
-    <w:p>
-      <w:pPr>
-        <w:pStyle w:val="ListParagraph"/>
-        <w:numPr>
-          <w:ilvl w:val="0"/>
-          <w:numId w:val="2"/>
-        </w:numPr>
-        <w:spacing w:after="60"/>
-      </w:pPr>
-      <w:r>
-        <w:t xml:space="preserve">Qualquer atendente abria qualquer protocolo pelo identificador, inclusive os de clientes de outros atendentes (resposta 200).</w:t>
-      </w:r>
-    </w:p>
-    <w:p>
-      <w:pPr>
-        <w:pStyle w:val="ListParagraph"/>
-        <w:numPr>
-          <w:ilvl w:val="0"/>
-          <w:numId w:val="2"/>
-        </w:numPr>
-        <w:spacing w:after="60"/>
-      </w:pPr>
-      <w:r>
-        <w:t xml:space="preserve">As salas do WebSocket não verificavam permissão e eventos eram enviados a todos os conectados.</w:t>
-      </w:r>
-    </w:p>
-    <w:p>
-      <w:pPr>
-        <w:pStyle w:val="ListParagraph"/>
-        <w:numPr>
-          <w:ilvl w:val="0"/>
-          <w:numId w:val="2"/>
-        </w:numPr>
-        <w:spacing w:after="60"/>
-      </w:pPr>
-      <w:r>
-        <w:t xml:space="preserve">O mesmo código do 2FA podia ser usado mais de uma vez, e segredos tinham valores padrão escritos no código.</w:t>
-      </w:r>
-    </w:p>
-    <w:p>
-      <w:pPr>
-        <w:pStyle w:val="Heading2"/>
-      </w:pPr>
-      <w:r>
-        <w:t xml:space="preserve">O que foi feito (depois)</w:t>
-      </w:r>
-    </w:p>
-    <w:p>
-      <w:pPr>
-        <w:pStyle w:val="ListParagraph"/>
-        <w:numPr>
-          <w:ilvl w:val="0"/>
-          <w:numId w:val="2"/>
-        </w:numPr>
-        <w:spacing w:after="60"/>
-      </w:pPr>
-      <w:r>
-        <w:t xml:space="preserve">Cadastro público cria sempre CLIENT (o campo de perfil é rejeitado: 400).</w:t>
-      </w:r>
-    </w:p>
-    <w:p>
-      <w:pPr>
-        <w:pStyle w:val="ListParagraph"/>
-        <w:numPr>
-          <w:ilvl w:val="0"/>
-          <w:numId w:val="2"/>
-        </w:numPr>
-        <w:spacing w:after="60"/>
-      </w:pPr>
-      <w:r>
-        <w:t xml:space="preserve">Menor privilégio: o atendente acessa só a fila e os protocolos atribuídos a ele (403 nos demais); a mesma regra vale no WebSocket.</w:t>
-      </w:r>
-    </w:p>
-    <w:p>
-      <w:pPr>
-        <w:pStyle w:val="ListParagraph"/>
-        <w:numPr>
-          <w:ilvl w:val="0"/>
-          <w:numId w:val="2"/>
-        </w:numPr>
-        <w:spacing w:after="60"/>
-      </w:pPr>
-      <w:r>
-        <w:t xml:space="preserve">2FA com anti-replay (cada código vale uma vez: 401 no reuso) e API que não sobe sem os segredos configurados.</w:t>
-      </w:r>
-    </w:p>
-    <w:p>
-      <w:pPr>
-        <w:pStyle w:val="ListParagraph"/>
-        <w:numPr>
-          <w:ilvl w:val="0"/>
-          <w:numId w:val="2"/>
-        </w:numPr>
-        <w:spacing w:after="60"/>
-      </w:pPr>
-      <w:r>
-        <w:t xml:space="preserve">LGPD: trilha de auditoria (logins, transferências, alterações), exportação dos dados do titular pelo app, vínculo do Telegram revogável e, do Telegram, apenas o identificador da conversa é guardado.</w:t>
-      </w:r>
-    </w:p>
-    <w:p>
-      <w:pPr>
-        <w:pStyle w:val="Heading2"/>
-      </w:pPr>
-      <w:r>
-        <w:t xml:space="preserve">Justificativa</w:t>
-      </w:r>
-    </w:p>
-    <w:p>
-      <w:pPr>
-        <w:spacing w:after="120"/>
-      </w:pPr>
-      <w:r>
-        <w:t xml:space="preserve">Uma operadora lida com dados pessoais de milhões de clientes. As correções atendem à LGPD (art. 6º, III, necessidade; art. 46, segurança; art. 18, direitos do titular) e aos critérios de requisitos não funcionais e maturidade técnica. As falhas foram confirmadas com chamadas reais à API da versão anterior.</w:t>
-      </w:r>
-    </w:p>
-    <w:p>
-      <w:pPr>
-        <w:pStyle w:val="Heading2"/>
-      </w:pPr>
-      <w:r>
-        <w:t xml:space="preserve">Evidências</w:t>
-      </w:r>
-    </w:p>
-    <w:p>
-      <w:pPr>
-        <w:keepNext/>
-        <w:spacing w:after="80" w:before="160"/>
-      </w:pPr>
-      <w:r>
-        <w:rPr>
-          <w:b/>
-          <w:bCs/>
-          <w:color w:val="FFFFFF"/>
-          <w:shd w:fill="E3000F" w:color="auto" w:val="clear"/>
-        </w:rPr>
-        <w:t xml:space="preserve"> ANTES </w:t>
+        <w:t xml:space="preserve">Painel: transferência feita pela IA, com motivo e resumo do caso para o atendente</w:t>
       </w:r>
     </w:p>
     <w:p>
@@ -2756,9 +2538,9 @@
       <w:r>
         <w:drawing>
           <wp:inline distT="0" distB="0" distL="0" distR="0">
-            <wp:extent cx="6096000" cy="2886075"/>
+            <wp:extent cx="5029200" cy="3143250"/>
             <wp:effectExtent t="0" r="0" b="0" l="0"/>
-            <wp:docPr id="16" name="antes-4-seguranca-api.png" descr="antes-4-seguranca-api.png" title="antes-4-seguranca-api.png"/>
+            <wp:docPr id="15" name="depois-3-dashboard-metricas-ia.png" descr="depois-3-dashboard-metricas-ia.png" title="depois-3-dashboard-metricas-ia.png"/>
             <wp:cNvGraphicFramePr>
               <a:graphicFrameLocks xmlns:a="http://schemas.openxmlformats.org/drawingml/2006/main" noChangeAspect="1"/>
             </wp:cNvGraphicFramePr>
@@ -2781,7 +2563,7 @@
                   <pic:spPr bwMode="auto">
                     <a:xfrm>
                       <a:off x="0" y="0"/>
-                      <a:ext cx="6096000" cy="2886075"/>
+                      <a:ext cx="5029200" cy="3143250"/>
                     </a:xfrm>
                     <a:prstGeom prst="rect">
                       <a:avLst/>
@@ -2807,7 +2589,160 @@
           <w:sz w:val="18"/>
           <w:szCs w:val="18"/>
         </w:rPr>
-        <w:t xml:space="preserve">Versão anterior: cadastro como ADMIN aceito e atendente abrindo protocolo de outro atendente</w:t>
+        <w:t xml:space="preserve">Dashboard: canais reais/mock, métricas da IA e selo "Transferido pela IA"</w:t>
+      </w:r>
+    </w:p>
+    <w:p>
+      <w:pPr>
+        <w:pStyle w:val="Heading1"/>
+        <w:pageBreakBefore/>
+      </w:pPr>
+      <w:r>
+        <w:t xml:space="preserve">Melhoria 4 — Segurança e LGPD</w:t>
+      </w:r>
+    </w:p>
+    <w:p>
+      <w:pPr>
+        <w:pStyle w:val="Heading2"/>
+      </w:pPr>
+      <w:r>
+        <w:t xml:space="preserve">Como estava (antes)</w:t>
+      </w:r>
+    </w:p>
+    <w:p>
+      <w:pPr>
+        <w:pStyle w:val="ListParagraph"/>
+        <w:numPr>
+          <w:ilvl w:val="0"/>
+          <w:numId w:val="2"/>
+        </w:numPr>
+        <w:spacing w:after="60"/>
+      </w:pPr>
+      <w:r>
+        <w:t xml:space="preserve">O cadastro público aceitava o campo de perfil: qualquer pessoa criava uma conta de ADMINISTRADOR (resposta 201).</w:t>
+      </w:r>
+    </w:p>
+    <w:p>
+      <w:pPr>
+        <w:pStyle w:val="ListParagraph"/>
+        <w:numPr>
+          <w:ilvl w:val="0"/>
+          <w:numId w:val="2"/>
+        </w:numPr>
+        <w:spacing w:after="60"/>
+      </w:pPr>
+      <w:r>
+        <w:t xml:space="preserve">Qualquer atendente abria qualquer protocolo pelo identificador, inclusive os de clientes de outros atendentes (resposta 200).</w:t>
+      </w:r>
+    </w:p>
+    <w:p>
+      <w:pPr>
+        <w:pStyle w:val="ListParagraph"/>
+        <w:numPr>
+          <w:ilvl w:val="0"/>
+          <w:numId w:val="2"/>
+        </w:numPr>
+        <w:spacing w:after="60"/>
+      </w:pPr>
+      <w:r>
+        <w:t xml:space="preserve">As salas do WebSocket não verificavam permissão e eventos eram enviados a todos os conectados.</w:t>
+      </w:r>
+    </w:p>
+    <w:p>
+      <w:pPr>
+        <w:pStyle w:val="ListParagraph"/>
+        <w:numPr>
+          <w:ilvl w:val="0"/>
+          <w:numId w:val="2"/>
+        </w:numPr>
+        <w:spacing w:after="60"/>
+      </w:pPr>
+      <w:r>
+        <w:t xml:space="preserve">O mesmo código do 2FA podia ser usado mais de uma vez, e segredos tinham valores padrão escritos no código.</w:t>
+      </w:r>
+    </w:p>
+    <w:p>
+      <w:pPr>
+        <w:pStyle w:val="Heading2"/>
+      </w:pPr>
+      <w:r>
+        <w:t xml:space="preserve">O que foi feito (depois)</w:t>
+      </w:r>
+    </w:p>
+    <w:p>
+      <w:pPr>
+        <w:pStyle w:val="ListParagraph"/>
+        <w:numPr>
+          <w:ilvl w:val="0"/>
+          <w:numId w:val="2"/>
+        </w:numPr>
+        <w:spacing w:after="60"/>
+      </w:pPr>
+      <w:r>
+        <w:t xml:space="preserve">Cadastro público cria sempre CLIENT (o campo de perfil é rejeitado: 400).</w:t>
+      </w:r>
+    </w:p>
+    <w:p>
+      <w:pPr>
+        <w:pStyle w:val="ListParagraph"/>
+        <w:numPr>
+          <w:ilvl w:val="0"/>
+          <w:numId w:val="2"/>
+        </w:numPr>
+        <w:spacing w:after="60"/>
+      </w:pPr>
+      <w:r>
+        <w:t xml:space="preserve">Menor privilégio: o atendente acessa só a fila e os protocolos atribuídos a ele (403 nos demais); a mesma regra vale no WebSocket.</w:t>
+      </w:r>
+    </w:p>
+    <w:p>
+      <w:pPr>
+        <w:pStyle w:val="ListParagraph"/>
+        <w:numPr>
+          <w:ilvl w:val="0"/>
+          <w:numId w:val="2"/>
+        </w:numPr>
+        <w:spacing w:after="60"/>
+      </w:pPr>
+      <w:r>
+        <w:t xml:space="preserve">2FA com anti-replay (cada código vale uma vez: 401 no reuso) e API que não sobe sem os segredos configurados.</w:t>
+      </w:r>
+    </w:p>
+    <w:p>
+      <w:pPr>
+        <w:pStyle w:val="ListParagraph"/>
+        <w:numPr>
+          <w:ilvl w:val="0"/>
+          <w:numId w:val="2"/>
+        </w:numPr>
+        <w:spacing w:after="60"/>
+      </w:pPr>
+      <w:r>
+        <w:t xml:space="preserve">LGPD: trilha de auditoria (logins, transferências, alterações), exportação dos dados do titular pelo app, vínculo do Telegram revogável e, do Telegram, apenas o identificador da conversa é guardado.</w:t>
+      </w:r>
+    </w:p>
+    <w:p>
+      <w:pPr>
+        <w:pStyle w:val="Heading2"/>
+      </w:pPr>
+      <w:r>
+        <w:t xml:space="preserve">Justificativa</w:t>
+      </w:r>
+    </w:p>
+    <w:p>
+      <w:pPr>
+        <w:spacing w:after="120"/>
+      </w:pPr>
+      <w:r>
+        <w:t xml:space="preserve">Uma operadora lida com dados pessoais de milhões de clientes. As correções atendem à LGPD (art. 6º, III, necessidade; art. 46, segurança; art. 18, direitos do titular) e aos critérios de requisitos não funcionais e maturidade técnica. As falhas foram confirmadas com chamadas reais à API da versão anterior.</w:t>
+      </w:r>
+    </w:p>
+    <w:p>
+      <w:pPr>
+        <w:pStyle w:val="Heading2"/>
+      </w:pPr>
+      <w:r>
+        <w:t xml:space="preserve">Evidências</w:t>
       </w:r>
     </w:p>
     <w:p>
@@ -2820,9 +2755,9 @@
           <w:b/>
           <w:bCs/>
           <w:color w:val="FFFFFF"/>
-          <w:shd w:fill="15803D" w:color="auto" w:val="clear"/>
+          <w:shd w:fill="E3000F" w:color="auto" w:val="clear"/>
         </w:rPr>
-        <w:t xml:space="preserve"> DEPOIS </w:t>
+        <w:t xml:space="preserve"> ANTES </w:t>
       </w:r>
     </w:p>
     <w:p>
@@ -2834,9 +2769,9 @@
       <w:r>
         <w:drawing>
           <wp:inline distT="0" distB="0" distL="0" distR="0">
-            <wp:extent cx="6096000" cy="2324100"/>
+            <wp:extent cx="6096000" cy="2886075"/>
             <wp:effectExtent t="0" r="0" b="0" l="0"/>
-            <wp:docPr id="17" name="depois-4-seguranca-api.png" descr="depois-4-seguranca-api.png" title="depois-4-seguranca-api.png"/>
+            <wp:docPr id="16" name="antes-4-seguranca-api.png" descr="antes-4-seguranca-api.png" title="antes-4-seguranca-api.png"/>
             <wp:cNvGraphicFramePr>
               <a:graphicFrameLocks xmlns:a="http://schemas.openxmlformats.org/drawingml/2006/main" noChangeAspect="1"/>
             </wp:cNvGraphicFramePr>
@@ -2859,7 +2794,7 @@
                   <pic:spPr bwMode="auto">
                     <a:xfrm>
                       <a:off x="0" y="0"/>
-                      <a:ext cx="6096000" cy="2324100"/>
+                      <a:ext cx="6096000" cy="2886075"/>
                     </a:xfrm>
                     <a:prstGeom prst="rect">
                       <a:avLst/>
@@ -2885,160 +2820,7 @@
           <w:sz w:val="18"/>
           <w:szCs w:val="18"/>
         </w:rPr>
-        <w:t xml:space="preserve">Versão atual: as mesmas chamadas são recusadas (400, 403) e o 2FA não aceita código reutilizado (401)</w:t>
-      </w:r>
-    </w:p>
-    <w:p>
-      <w:pPr>
-        <w:pStyle w:val="Heading1"/>
-        <w:pageBreakBefore/>
-      </w:pPr>
-      <w:r>
-        <w:t xml:space="preserve">Melhoria 5 — Interface do usuário</w:t>
-      </w:r>
-    </w:p>
-    <w:p>
-      <w:pPr>
-        <w:pStyle w:val="Heading2"/>
-      </w:pPr>
-      <w:r>
-        <w:t xml:space="preserve">Como estava (antes)</w:t>
-      </w:r>
-    </w:p>
-    <w:p>
-      <w:pPr>
-        <w:pStyle w:val="ListParagraph"/>
-        <w:numPr>
-          <w:ilvl w:val="0"/>
-          <w:numId w:val="2"/>
-        </w:numPr>
-        <w:spacing w:after="60"/>
-      </w:pPr>
-      <w:r>
-        <w:t xml:space="preserve">Ao configurar o 2FA obrigatório, a tela do atendente ficava em branco: o QR Code nunca aparecia e o primeiro acesso pela interface era impossível.</w:t>
-      </w:r>
-    </w:p>
-    <w:p>
-      <w:pPr>
-        <w:pStyle w:val="ListParagraph"/>
-        <w:numPr>
-          <w:ilvl w:val="0"/>
-          <w:numId w:val="2"/>
-        </w:numPr>
-        <w:spacing w:after="60"/>
-      </w:pPr>
-      <w:r>
-        <w:t xml:space="preserve">Atualizar a página (F5) ou abrir um link direto para um protocolo levava de volta à tela inicial.</w:t>
-      </w:r>
-    </w:p>
-    <w:p>
-      <w:pPr>
-        <w:pStyle w:val="ListParagraph"/>
-        <w:numPr>
-          <w:ilvl w:val="0"/>
-          <w:numId w:val="2"/>
-        </w:numPr>
-        <w:spacing w:after="60"/>
-      </w:pPr>
-      <w:r>
-        <w:t xml:space="preserve">Não havia indicação de quais canais eram reais e quais eram simulados, nem tela para conectar canais externos.</w:t>
-      </w:r>
-    </w:p>
-    <w:p>
-      <w:pPr>
-        <w:pStyle w:val="Heading2"/>
-      </w:pPr>
-      <w:r>
-        <w:t xml:space="preserve">O que foi feito (depois)</w:t>
-      </w:r>
-    </w:p>
-    <w:p>
-      <w:pPr>
-        <w:pStyle w:val="ListParagraph"/>
-        <w:numPr>
-          <w:ilvl w:val="0"/>
-          <w:numId w:val="2"/>
-        </w:numPr>
-        <w:spacing w:after="60"/>
-      </w:pPr>
-      <w:r>
-        <w:t xml:space="preserve">QR Code do 2FA funcionando no painel e no app (a tela codificava a imagem inteira em vez do link do autenticador).</w:t>
-      </w:r>
-    </w:p>
-    <w:p>
-      <w:pPr>
-        <w:pStyle w:val="ListParagraph"/>
-        <w:numPr>
-          <w:ilvl w:val="0"/>
-          <w:numId w:val="2"/>
-        </w:numPr>
-        <w:spacing w:after="60"/>
-      </w:pPr>
-      <w:r>
-        <w:t xml:space="preserve">A sessão é restaurada no primeiro carregamento: F5 e links diretos mantêm a página.</w:t>
-      </w:r>
-    </w:p>
-    <w:p>
-      <w:pPr>
-        <w:pStyle w:val="ListParagraph"/>
-        <w:numPr>
-          <w:ilvl w:val="0"/>
-          <w:numId w:val="2"/>
-        </w:numPr>
-        <w:spacing w:after="60"/>
-      </w:pPr>
-      <w:r>
-        <w:t xml:space="preserve">Tela "Conectar Telegram" no app (código, botão "Abrir no Telegram", QR Code e desvínculo).</w:t>
-      </w:r>
-    </w:p>
-    <w:p>
-      <w:pPr>
-        <w:pStyle w:val="ListParagraph"/>
-        <w:numPr>
-          <w:ilvl w:val="0"/>
-          <w:numId w:val="2"/>
-        </w:numPr>
-        <w:spacing w:after="60"/>
-      </w:pPr>
-      <w:r>
-        <w:t xml:space="preserve">Painel com indicadores de canal real/mock, card "Canais do cliente", card da assistente e "digitando…".</w:t>
-      </w:r>
-    </w:p>
-    <w:p>
-      <w:pPr>
-        <w:pStyle w:val="ListParagraph"/>
-        <w:numPr>
-          <w:ilvl w:val="0"/>
-          <w:numId w:val="2"/>
-        </w:numPr>
-        <w:spacing w:after="60"/>
-      </w:pPr>
-      <w:r>
-        <w:t xml:space="preserve">Mensagens identificadas por canal ("via Telegram", "via WebChat", "via Telefone") nos dois apps.</w:t>
-      </w:r>
-    </w:p>
-    <w:p>
-      <w:pPr>
-        <w:pStyle w:val="Heading2"/>
-      </w:pPr>
-      <w:r>
-        <w:t xml:space="preserve">Justificativa</w:t>
-      </w:r>
-    </w:p>
-    <w:p>
-      <w:pPr>
-        <w:spacing w:after="120"/>
-      </w:pPr>
-      <w:r>
-        <w:t xml:space="preserve">A Sprint 4 pede explicitamente melhorias de interface. Os dois primeiros itens eram defeitos que impediam o uso, um deles bloqueando o primeiro acesso do atendente. Os demais deixam visível para o cliente, para o atendente e para a banca o que é real, o que é simulado e o que a IA está fazendo.</w:t>
-      </w:r>
-    </w:p>
-    <w:p>
-      <w:pPr>
-        <w:pStyle w:val="Heading2"/>
-      </w:pPr>
-      <w:r>
-        <w:t xml:space="preserve">Evidências</w:t>
+        <w:t xml:space="preserve">Versão anterior: cadastro como ADMIN aceito e atendente abrindo protocolo de outro atendente</w:t>
       </w:r>
     </w:p>
     <w:p>
@@ -3051,9 +2833,9 @@
           <w:b/>
           <w:bCs/>
           <w:color w:val="FFFFFF"/>
-          <w:shd w:fill="E3000F" w:color="auto" w:val="clear"/>
+          <w:shd w:fill="15803D" w:color="auto" w:val="clear"/>
         </w:rPr>
-        <w:t xml:space="preserve"> ANTES </w:t>
+        <w:t xml:space="preserve"> DEPOIS </w:t>
       </w:r>
     </w:p>
     <w:p>
@@ -3065,9 +2847,9 @@
       <w:r>
         <w:drawing>
           <wp:inline distT="0" distB="0" distL="0" distR="0">
-            <wp:extent cx="4143375" cy="2476500"/>
+            <wp:extent cx="6096000" cy="2324100"/>
             <wp:effectExtent t="0" r="0" b="0" l="0"/>
-            <wp:docPr id="18" name="antes-5-2fa-tela-em-branco.png" descr="antes-5-2fa-tela-em-branco.png" title="antes-5-2fa-tela-em-branco.png"/>
+            <wp:docPr id="17" name="depois-4-seguranca-api.png" descr="depois-4-seguranca-api.png" title="depois-4-seguranca-api.png"/>
             <wp:cNvGraphicFramePr>
               <a:graphicFrameLocks xmlns:a="http://schemas.openxmlformats.org/drawingml/2006/main" noChangeAspect="1"/>
             </wp:cNvGraphicFramePr>
@@ -3090,7 +2872,7 @@
                   <pic:spPr bwMode="auto">
                     <a:xfrm>
                       <a:off x="0" y="0"/>
-                      <a:ext cx="4143375" cy="2476500"/>
+                      <a:ext cx="6096000" cy="2324100"/>
                     </a:xfrm>
                     <a:prstGeom prst="rect">
                       <a:avLst/>
@@ -3116,7 +2898,160 @@
           <w:sz w:val="18"/>
           <w:szCs w:val="18"/>
         </w:rPr>
-        <w:t xml:space="preserve">Configurar o 2FA: a tela ficava completamente em branco</w:t>
+        <w:t xml:space="preserve">Versão atual: as mesmas chamadas são recusadas (400, 403) e o 2FA não aceita código reutilizado (401)</w:t>
+      </w:r>
+    </w:p>
+    <w:p>
+      <w:pPr>
+        <w:pStyle w:val="Heading1"/>
+        <w:pageBreakBefore/>
+      </w:pPr>
+      <w:r>
+        <w:t xml:space="preserve">Melhoria 5 — Interface do usuário</w:t>
+      </w:r>
+    </w:p>
+    <w:p>
+      <w:pPr>
+        <w:pStyle w:val="Heading2"/>
+      </w:pPr>
+      <w:r>
+        <w:t xml:space="preserve">Como estava (antes)</w:t>
+      </w:r>
+    </w:p>
+    <w:p>
+      <w:pPr>
+        <w:pStyle w:val="ListParagraph"/>
+        <w:numPr>
+          <w:ilvl w:val="0"/>
+          <w:numId w:val="2"/>
+        </w:numPr>
+        <w:spacing w:after="60"/>
+      </w:pPr>
+      <w:r>
+        <w:t xml:space="preserve">Ao configurar o 2FA obrigatório, a tela do atendente ficava em branco: o QR Code nunca aparecia e o primeiro acesso pela interface era impossível.</w:t>
+      </w:r>
+    </w:p>
+    <w:p>
+      <w:pPr>
+        <w:pStyle w:val="ListParagraph"/>
+        <w:numPr>
+          <w:ilvl w:val="0"/>
+          <w:numId w:val="2"/>
+        </w:numPr>
+        <w:spacing w:after="60"/>
+      </w:pPr>
+      <w:r>
+        <w:t xml:space="preserve">Atualizar a página (F5) ou abrir um link direto para um protocolo levava de volta à tela inicial.</w:t>
+      </w:r>
+    </w:p>
+    <w:p>
+      <w:pPr>
+        <w:pStyle w:val="ListParagraph"/>
+        <w:numPr>
+          <w:ilvl w:val="0"/>
+          <w:numId w:val="2"/>
+        </w:numPr>
+        <w:spacing w:after="60"/>
+      </w:pPr>
+      <w:r>
+        <w:t xml:space="preserve">Não havia indicação de quais canais eram reais e quais eram simulados, nem tela para conectar canais externos.</w:t>
+      </w:r>
+    </w:p>
+    <w:p>
+      <w:pPr>
+        <w:pStyle w:val="Heading2"/>
+      </w:pPr>
+      <w:r>
+        <w:t xml:space="preserve">O que foi feito (depois)</w:t>
+      </w:r>
+    </w:p>
+    <w:p>
+      <w:pPr>
+        <w:pStyle w:val="ListParagraph"/>
+        <w:numPr>
+          <w:ilvl w:val="0"/>
+          <w:numId w:val="2"/>
+        </w:numPr>
+        <w:spacing w:after="60"/>
+      </w:pPr>
+      <w:r>
+        <w:t xml:space="preserve">QR Code do 2FA funcionando no painel e no app (a tela codificava a imagem inteira em vez do link do autenticador).</w:t>
+      </w:r>
+    </w:p>
+    <w:p>
+      <w:pPr>
+        <w:pStyle w:val="ListParagraph"/>
+        <w:numPr>
+          <w:ilvl w:val="0"/>
+          <w:numId w:val="2"/>
+        </w:numPr>
+        <w:spacing w:after="60"/>
+      </w:pPr>
+      <w:r>
+        <w:t xml:space="preserve">A sessão é restaurada no primeiro carregamento: F5 e links diretos mantêm a página.</w:t>
+      </w:r>
+    </w:p>
+    <w:p>
+      <w:pPr>
+        <w:pStyle w:val="ListParagraph"/>
+        <w:numPr>
+          <w:ilvl w:val="0"/>
+          <w:numId w:val="2"/>
+        </w:numPr>
+        <w:spacing w:after="60"/>
+      </w:pPr>
+      <w:r>
+        <w:t xml:space="preserve">Tela "Conectar Telegram" no app (código, botão "Abrir no Telegram", QR Code e desvínculo).</w:t>
+      </w:r>
+    </w:p>
+    <w:p>
+      <w:pPr>
+        <w:pStyle w:val="ListParagraph"/>
+        <w:numPr>
+          <w:ilvl w:val="0"/>
+          <w:numId w:val="2"/>
+        </w:numPr>
+        <w:spacing w:after="60"/>
+      </w:pPr>
+      <w:r>
+        <w:t xml:space="preserve">Painel com indicadores de canal real/mock, card "Canais do cliente", card da assistente e "digitando…".</w:t>
+      </w:r>
+    </w:p>
+    <w:p>
+      <w:pPr>
+        <w:pStyle w:val="ListParagraph"/>
+        <w:numPr>
+          <w:ilvl w:val="0"/>
+          <w:numId w:val="2"/>
+        </w:numPr>
+        <w:spacing w:after="60"/>
+      </w:pPr>
+      <w:r>
+        <w:t xml:space="preserve">Mensagens identificadas por canal ("via Telegram", "via WebChat", "via Telefone") nos dois apps.</w:t>
+      </w:r>
+    </w:p>
+    <w:p>
+      <w:pPr>
+        <w:pStyle w:val="Heading2"/>
+      </w:pPr>
+      <w:r>
+        <w:t xml:space="preserve">Justificativa</w:t>
+      </w:r>
+    </w:p>
+    <w:p>
+      <w:pPr>
+        <w:spacing w:after="120"/>
+      </w:pPr>
+      <w:r>
+        <w:t xml:space="preserve">A Sprint 4 pede explicitamente melhorias de interface. Os dois primeiros itens eram defeitos que impediam o uso, um deles bloqueando o primeiro acesso do atendente. Os demais deixam visível para o cliente, para o atendente e para a banca o que é real, o que é simulado e o que a IA está fazendo.</w:t>
+      </w:r>
+    </w:p>
+    <w:p>
+      <w:pPr>
+        <w:pStyle w:val="Heading2"/>
+      </w:pPr>
+      <w:r>
+        <w:t xml:space="preserve">Evidências</w:t>
       </w:r>
     </w:p>
     <w:p>
@@ -3129,9 +3064,9 @@
           <w:b/>
           <w:bCs/>
           <w:color w:val="FFFFFF"/>
-          <w:shd w:fill="15803D" w:color="auto" w:val="clear"/>
+          <w:shd w:fill="E3000F" w:color="auto" w:val="clear"/>
         </w:rPr>
-        <w:t xml:space="preserve"> DEPOIS </w:t>
+        <w:t xml:space="preserve"> ANTES </w:t>
       </w:r>
     </w:p>
     <w:p>
@@ -3143,9 +3078,9 @@
       <w:r>
         <w:drawing>
           <wp:inline distT="0" distB="0" distL="0" distR="0">
-            <wp:extent cx="5267325" cy="3143250"/>
+            <wp:extent cx="4143375" cy="2476500"/>
             <wp:effectExtent t="0" r="0" b="0" l="0"/>
-            <wp:docPr id="19" name="depois-5-2fa-qr-code.png" descr="depois-5-2fa-qr-code.png" title="depois-5-2fa-qr-code.png"/>
+            <wp:docPr id="18" name="antes-5-2fa-tela-em-branco.png" descr="antes-5-2fa-tela-em-branco.png" title="antes-5-2fa-tela-em-branco.png"/>
             <wp:cNvGraphicFramePr>
               <a:graphicFrameLocks xmlns:a="http://schemas.openxmlformats.org/drawingml/2006/main" noChangeAspect="1"/>
             </wp:cNvGraphicFramePr>
@@ -3168,7 +3103,7 @@
                   <pic:spPr bwMode="auto">
                     <a:xfrm>
                       <a:off x="0" y="0"/>
-                      <a:ext cx="5267325" cy="3143250"/>
+                      <a:ext cx="4143375" cy="2476500"/>
                     </a:xfrm>
                     <a:prstGeom prst="rect">
                       <a:avLst/>
@@ -3194,85 +3129,7 @@
           <w:sz w:val="18"/>
           <w:szCs w:val="18"/>
         </w:rPr>
-        <w:t xml:space="preserve">Configurar o 2FA: QR Code e chave manual exibidos</w:t>
-      </w:r>
-    </w:p>
-    <w:p>
-      <w:pPr>
-        <w:keepNext/>
-        <w:spacing w:after="80" w:before="160"/>
-      </w:pPr>
-      <w:r>
-        <w:rPr>
-          <w:b/>
-          <w:bCs/>
-          <w:color w:val="FFFFFF"/>
-          <w:shd w:fill="E3000F" w:color="auto" w:val="clear"/>
-        </w:rPr>
-        <w:t xml:space="preserve"> ANTES </w:t>
-      </w:r>
-    </w:p>
-    <w:p>
-      <w:pPr>
-        <w:keepNext/>
-        <w:spacing w:after="40"/>
-        <w:jc w:val="center"/>
-      </w:pPr>
-      <w:r>
-        <w:drawing>
-          <wp:inline distT="0" distB="0" distL="0" distR="0">
-            <wp:extent cx="4781550" cy="2857500"/>
-            <wp:effectExtent t="0" r="0" b="0" l="0"/>
-            <wp:docPr id="20" name="antes-5-link-direto-volta-inicio.png" descr="antes-5-link-direto-volta-inicio.png" title="antes-5-link-direto-volta-inicio.png"/>
-            <wp:cNvGraphicFramePr>
-              <a:graphicFrameLocks xmlns:a="http://schemas.openxmlformats.org/drawingml/2006/main" noChangeAspect="1"/>
-            </wp:cNvGraphicFramePr>
-            <a:graphic xmlns:a="http://schemas.openxmlformats.org/drawingml/2006/main">
-              <a:graphicData uri="http://schemas.openxmlformats.org/drawingml/2006/picture">
-                <pic:pic xmlns:pic="http://schemas.openxmlformats.org/drawingml/2006/picture">
-                  <pic:nvPicPr>
-                    <pic:cNvPr id="0" name="" descr=""/>
-                    <pic:cNvPicPr>
-                      <a:picLocks noChangeAspect="1" noChangeArrowheads="1"/>
-                    </pic:cNvPicPr>
-                  </pic:nvPicPr>
-                  <pic:blipFill>
-                    <a:blip r:embed="rId18" cstate="none"/>
-                    <a:srcRect/>
-                    <a:stretch>
-                      <a:fillRect/>
-                    </a:stretch>
-                  </pic:blipFill>
-                  <pic:spPr bwMode="auto">
-                    <a:xfrm>
-                      <a:off x="0" y="0"/>
-                      <a:ext cx="4781550" cy="2857500"/>
-                    </a:xfrm>
-                    <a:prstGeom prst="rect">
-                      <a:avLst/>
-                    </a:prstGeom>
-                  </pic:spPr>
-                </pic:pic>
-              </a:graphicData>
-            </a:graphic>
-          </wp:inline>
-        </w:drawing>
-      </w:r>
-    </w:p>
-    <w:p>
-      <w:pPr>
-        <w:spacing w:after="160"/>
-        <w:jc w:val="center"/>
-      </w:pPr>
-      <w:r>
-        <w:rPr>
-          <w:i/>
-          <w:iCs/>
-          <w:color w:val="6B7280"/>
-          <w:sz w:val="18"/>
-          <w:szCs w:val="18"/>
-        </w:rPr>
-        <w:t xml:space="preserve">Link direto para um protocolo: o sistema voltava para a tela inicial</w:t>
+        <w:t xml:space="preserve">Configurar o 2FA: a tela ficava completamente em branco</w:t>
       </w:r>
     </w:p>
     <w:p>
@@ -3299,9 +3156,9 @@
       <w:r>
         <w:drawing>
           <wp:inline distT="0" distB="0" distL="0" distR="0">
-            <wp:extent cx="4781550" cy="2857500"/>
+            <wp:extent cx="5267325" cy="3143250"/>
             <wp:effectExtent t="0" r="0" b="0" l="0"/>
-            <wp:docPr id="21" name="depois-5-link-direto-mantem-pagina.png" descr="depois-5-link-direto-mantem-pagina.png" title="depois-5-link-direto-mantem-pagina.png"/>
+            <wp:docPr id="19" name="depois-5-2fa-qr-code.png" descr="depois-5-2fa-qr-code.png" title="depois-5-2fa-qr-code.png"/>
             <wp:cNvGraphicFramePr>
               <a:graphicFrameLocks xmlns:a="http://schemas.openxmlformats.org/drawingml/2006/main" noChangeAspect="1"/>
             </wp:cNvGraphicFramePr>
@@ -3324,6 +3181,84 @@
                   <pic:spPr bwMode="auto">
                     <a:xfrm>
                       <a:off x="0" y="0"/>
+                      <a:ext cx="5267325" cy="3143250"/>
+                    </a:xfrm>
+                    <a:prstGeom prst="rect">
+                      <a:avLst/>
+                    </a:prstGeom>
+                  </pic:spPr>
+                </pic:pic>
+              </a:graphicData>
+            </a:graphic>
+          </wp:inline>
+        </w:drawing>
+      </w:r>
+    </w:p>
+    <w:p>
+      <w:pPr>
+        <w:spacing w:after="160"/>
+        <w:jc w:val="center"/>
+      </w:pPr>
+      <w:r>
+        <w:rPr>
+          <w:i/>
+          <w:iCs/>
+          <w:color w:val="6B7280"/>
+          <w:sz w:val="18"/>
+          <w:szCs w:val="18"/>
+        </w:rPr>
+        <w:t xml:space="preserve">Configurar o 2FA: QR Code e chave manual exibidos</w:t>
+      </w:r>
+    </w:p>
+    <w:p>
+      <w:pPr>
+        <w:keepNext/>
+        <w:spacing w:after="80" w:before="160"/>
+      </w:pPr>
+      <w:r>
+        <w:rPr>
+          <w:b/>
+          <w:bCs/>
+          <w:color w:val="FFFFFF"/>
+          <w:shd w:fill="E3000F" w:color="auto" w:val="clear"/>
+        </w:rPr>
+        <w:t xml:space="preserve"> ANTES </w:t>
+      </w:r>
+    </w:p>
+    <w:p>
+      <w:pPr>
+        <w:keepNext/>
+        <w:spacing w:after="40"/>
+        <w:jc w:val="center"/>
+      </w:pPr>
+      <w:r>
+        <w:drawing>
+          <wp:inline distT="0" distB="0" distL="0" distR="0">
+            <wp:extent cx="4781550" cy="2857500"/>
+            <wp:effectExtent t="0" r="0" b="0" l="0"/>
+            <wp:docPr id="20" name="antes-5-link-direto-volta-inicio.png" descr="antes-5-link-direto-volta-inicio.png" title="antes-5-link-direto-volta-inicio.png"/>
+            <wp:cNvGraphicFramePr>
+              <a:graphicFrameLocks xmlns:a="http://schemas.openxmlformats.org/drawingml/2006/main" noChangeAspect="1"/>
+            </wp:cNvGraphicFramePr>
+            <a:graphic xmlns:a="http://schemas.openxmlformats.org/drawingml/2006/main">
+              <a:graphicData uri="http://schemas.openxmlformats.org/drawingml/2006/picture">
+                <pic:pic xmlns:pic="http://schemas.openxmlformats.org/drawingml/2006/picture">
+                  <pic:nvPicPr>
+                    <pic:cNvPr id="0" name="" descr=""/>
+                    <pic:cNvPicPr>
+                      <a:picLocks noChangeAspect="1" noChangeArrowheads="1"/>
+                    </pic:cNvPicPr>
+                  </pic:nvPicPr>
+                  <pic:blipFill>
+                    <a:blip r:embed="rId19" cstate="none"/>
+                    <a:srcRect/>
+                    <a:stretch>
+                      <a:fillRect/>
+                    </a:stretch>
+                  </pic:blipFill>
+                  <pic:spPr bwMode="auto">
+                    <a:xfrm>
+                      <a:off x="0" y="0"/>
                       <a:ext cx="4781550" cy="2857500"/>
                     </a:xfrm>
                     <a:prstGeom prst="rect">
@@ -3350,7 +3285,22 @@
           <w:sz w:val="18"/>
           <w:szCs w:val="18"/>
         </w:rPr>
-        <w:t xml:space="preserve">Link direto / F5: a página do protocolo é mantida</w:t>
+        <w:t xml:space="preserve">Link direto para um protocolo: o sistema voltava para a tela inicial</w:t>
+      </w:r>
+    </w:p>
+    <w:p>
+      <w:pPr>
+        <w:keepNext/>
+        <w:spacing w:after="80" w:before="160"/>
+      </w:pPr>
+      <w:r>
+        <w:rPr>
+          <w:b/>
+          <w:bCs/>
+          <w:color w:val="FFFFFF"/>
+          <w:shd w:fill="15803D" w:color="auto" w:val="clear"/>
+        </w:rPr>
+        <w:t xml:space="preserve"> DEPOIS </w:t>
       </w:r>
     </w:p>
     <w:p>
@@ -3362,9 +3312,9 @@
       <w:r>
         <w:drawing>
           <wp:inline distT="0" distB="0" distL="0" distR="0">
-            <wp:extent cx="2095500" cy="4381500"/>
+            <wp:extent cx="4781550" cy="2857500"/>
             <wp:effectExtent t="0" r="0" b="0" l="0"/>
-            <wp:docPr id="22" name="depois-5-cliente-telegram-conectado.png" descr="depois-5-cliente-telegram-conectado.png" title="depois-5-cliente-telegram-conectado.png"/>
+            <wp:docPr id="21" name="depois-5-link-direto-mantem-pagina.png" descr="depois-5-link-direto-mantem-pagina.png" title="depois-5-link-direto-mantem-pagina.png"/>
             <wp:cNvGraphicFramePr>
               <a:graphicFrameLocks xmlns:a="http://schemas.openxmlformats.org/drawingml/2006/main" noChangeAspect="1"/>
             </wp:cNvGraphicFramePr>
@@ -3387,7 +3337,7 @@
                   <pic:spPr bwMode="auto">
                     <a:xfrm>
                       <a:off x="0" y="0"/>
-                      <a:ext cx="2095500" cy="4381500"/>
+                      <a:ext cx="4781550" cy="2857500"/>
                     </a:xfrm>
                     <a:prstGeom prst="rect">
                       <a:avLst/>
@@ -3413,161 +3363,7 @@
           <w:sz w:val="18"/>
           <w:szCs w:val="18"/>
         </w:rPr>
-        <w:t xml:space="preserve">Nova tela do app: Telegram conectado, com opção de desvincular (LGPD)</w:t>
-      </w:r>
-    </w:p>
-    <w:p>
-      <w:pPr>
-        <w:pStyle w:val="Heading1"/>
-        <w:pageBreakBefore/>
-      </w:pPr>
-      <w:r>
-        <w:t xml:space="preserve">3. Como as melhorias foram validadas</w:t>
-      </w:r>
-    </w:p>
-    <w:p>
-      <w:pPr>
-        <w:spacing w:after="120"/>
-      </w:pPr>
-      <w:r>
-        <w:t xml:space="preserve">Todas as melhorias foram testadas, e os testes automatizados ficam no repositório (npm test):</w:t>
-      </w:r>
-    </w:p>
-    <w:p>
-      <w:pPr>
-        <w:pStyle w:val="ListParagraph"/>
-        <w:numPr>
-          <w:ilvl w:val="0"/>
-          <w:numId w:val="2"/>
-        </w:numPr>
-        <w:spacing w:after="60"/>
-      </w:pPr>
-      <w:r>
-        <w:rPr>
-          <w:b/>
-          <w:bCs/>
-        </w:rPr>
-        <w:t xml:space="preserve">Testes unitários (Jest): </w:t>
-      </w:r>
-      <w:r>
-        <w:t xml:space="preserve">regras do bot, canais, regra de acesso, motores e travas da assistente.</w:t>
-      </w:r>
-    </w:p>
-    <w:p>
-      <w:pPr>
-        <w:pStyle w:val="ListParagraph"/>
-        <w:numPr>
-          <w:ilvl w:val="0"/>
-          <w:numId w:val="2"/>
-        </w:numPr>
-        <w:spacing w:after="60"/>
-      </w:pPr>
-      <w:r>
-        <w:rPr>
-          <w:b/>
-          <w:bCs/>
-        </w:rPr>
-        <w:t xml:space="preserve">E2E do Telegram: </w:t>
-      </w:r>
-      <w:r>
-        <w:t xml:space="preserve">29 verificações com o backend real e uma Bot API simulada: vínculo, protocolo, troca de canal, entrega, idempotência, segurança e LGPD.</w:t>
-      </w:r>
-    </w:p>
-    <w:p>
-      <w:pPr>
-        <w:pStyle w:val="ListParagraph"/>
-        <w:numPr>
-          <w:ilvl w:val="0"/>
-          <w:numId w:val="2"/>
-        </w:numPr>
-        <w:spacing w:after="60"/>
-      </w:pPr>
-      <w:r>
-        <w:rPr>
-          <w:b/>
-          <w:bCs/>
-        </w:rPr>
-        <w:t xml:space="preserve">E2E da assistente: </w:t>
-      </w:r>
-      <w:r>
-        <w:t xml:space="preserve">12 verificações: resposta no Telegram e no WebChat, transferência com resumo, saída da IA quando o humano assume, métricas.</w:t>
-      </w:r>
-    </w:p>
-    <w:p>
-      <w:pPr>
-        <w:pStyle w:val="ListParagraph"/>
-        <w:numPr>
-          <w:ilvl w:val="0"/>
-          <w:numId w:val="2"/>
-        </w:numPr>
-        <w:spacing w:after="60"/>
-      </w:pPr>
-      <w:r>
-        <w:rPr>
-          <w:b/>
-          <w:bCs/>
-        </w:rPr>
-        <w:t xml:space="preserve">E2E de interface (Playwright): </w:t>
-      </w:r>
-      <w:r>
-        <w:t xml:space="preserve">16 verificações no navegador, incluindo a configuração do 2FA pela tela e a recuperação após o servidor reiniciar.</w:t>
-      </w:r>
-    </w:p>
-    <w:p>
-      <w:pPr>
-        <w:pStyle w:val="ListParagraph"/>
-        <w:numPr>
-          <w:ilvl w:val="0"/>
-          <w:numId w:val="2"/>
-        </w:numPr>
-        <w:spacing w:after="60"/>
-      </w:pPr>
-      <w:r>
-        <w:rPr>
-          <w:b/>
-          <w:bCs/>
-        </w:rPr>
-        <w:t xml:space="preserve">Avaliação da IA real: </w:t>
-      </w:r>
-      <w:r>
-        <w:t xml:space="preserve">cenários de conversa executados contra o modelo local (4 de 4 com o desfecho esperado).</w:t>
-      </w:r>
-    </w:p>
-    <w:p>
-      <w:pPr>
-        <w:pStyle w:val="ListParagraph"/>
-        <w:numPr>
-          <w:ilvl w:val="0"/>
-          <w:numId w:val="2"/>
-        </w:numPr>
-        <w:spacing w:after="60"/>
-      </w:pPr>
-      <w:r>
-        <w:rPr>
-          <w:b/>
-          <w:bCs/>
-        </w:rPr>
-        <w:t xml:space="preserve">Teste manual com o bot real: </w:t>
-      </w:r>
-      <w:r>
-        <w:t xml:space="preserve">jornada Telegram → atendente → WebChat → telefone executada ponta a ponta (telas reais neste documento).</w:t>
-      </w:r>
-    </w:p>
-    <w:p>
-      <w:pPr>
-        <w:spacing w:before="120"/>
-      </w:pPr>
-      <w:r>
-        <w:t xml:space="preserve">Algumas correções foram feitas com um teste que falhava antes e passava depois (por exemplo, a tela em branco do 2FA e a recuperação após queda de conexão).</w:t>
-      </w:r>
-    </w:p>
-    <w:p>
-      <w:pPr>
-        <w:pStyle w:val="Heading1"/>
-        <w:pageBreakBefore/>
-      </w:pPr>
-      <w:r>
-        <w:t xml:space="preserve">Anexo A — Arquitetura da solução</w:t>
+        <w:t xml:space="preserve">Link direto / F5: a página do protocolo é mantida</w:t>
       </w:r>
     </w:p>
     <w:p>
@@ -3579,9 +3375,9 @@
       <w:r>
         <w:drawing>
           <wp:inline distT="0" distB="0" distL="0" distR="0">
-            <wp:extent cx="6096000" cy="2952750"/>
+            <wp:extent cx="2095500" cy="4381500"/>
             <wp:effectExtent t="0" r="0" b="0" l="0"/>
-            <wp:docPr id="23" name="diagrama-arquitetura.png" descr="diagrama-arquitetura.png" title="diagrama-arquitetura.png"/>
+            <wp:docPr id="22" name="depois-5-cliente-telegram-conectado.png" descr="depois-5-cliente-telegram-conectado.png" title="depois-5-cliente-telegram-conectado.png"/>
             <wp:cNvGraphicFramePr>
               <a:graphicFrameLocks xmlns:a="http://schemas.openxmlformats.org/drawingml/2006/main" noChangeAspect="1"/>
             </wp:cNvGraphicFramePr>
@@ -3604,7 +3400,7 @@
                   <pic:spPr bwMode="auto">
                     <a:xfrm>
                       <a:off x="0" y="0"/>
-                      <a:ext cx="6096000" cy="2952750"/>
+                      <a:ext cx="2095500" cy="4381500"/>
                     </a:xfrm>
                     <a:prstGeom prst="rect">
                       <a:avLst/>
@@ -3630,7 +3426,161 @@
           <w:sz w:val="18"/>
           <w:szCs w:val="18"/>
         </w:rPr>
-        <w:t xml:space="preserve">Componentes: frontends, canais, backend modular e IA local</w:t>
+        <w:t xml:space="preserve">Nova tela do app: Telegram conectado, com opção de desvincular (LGPD)</w:t>
+      </w:r>
+    </w:p>
+    <w:p>
+      <w:pPr>
+        <w:pStyle w:val="Heading1"/>
+        <w:pageBreakBefore/>
+      </w:pPr>
+      <w:r>
+        <w:t xml:space="preserve">3. Como as melhorias foram validadas</w:t>
+      </w:r>
+    </w:p>
+    <w:p>
+      <w:pPr>
+        <w:spacing w:after="120"/>
+      </w:pPr>
+      <w:r>
+        <w:t xml:space="preserve">Todas as melhorias foram testadas, e os testes automatizados ficam no repositório (npm test):</w:t>
+      </w:r>
+    </w:p>
+    <w:p>
+      <w:pPr>
+        <w:pStyle w:val="ListParagraph"/>
+        <w:numPr>
+          <w:ilvl w:val="0"/>
+          <w:numId w:val="2"/>
+        </w:numPr>
+        <w:spacing w:after="60"/>
+      </w:pPr>
+      <w:r>
+        <w:rPr>
+          <w:b/>
+          <w:bCs/>
+        </w:rPr>
+        <w:t xml:space="preserve">Testes unitários (Jest): </w:t>
+      </w:r>
+      <w:r>
+        <w:t xml:space="preserve">regras do bot, canais, regra de acesso, motores e travas da assistente.</w:t>
+      </w:r>
+    </w:p>
+    <w:p>
+      <w:pPr>
+        <w:pStyle w:val="ListParagraph"/>
+        <w:numPr>
+          <w:ilvl w:val="0"/>
+          <w:numId w:val="2"/>
+        </w:numPr>
+        <w:spacing w:after="60"/>
+      </w:pPr>
+      <w:r>
+        <w:rPr>
+          <w:b/>
+          <w:bCs/>
+        </w:rPr>
+        <w:t xml:space="preserve">E2E do Telegram: </w:t>
+      </w:r>
+      <w:r>
+        <w:t xml:space="preserve">29 verificações com o backend real e uma Bot API simulada: vínculo, protocolo, troca de canal, entrega, idempotência, segurança e LGPD.</w:t>
+      </w:r>
+    </w:p>
+    <w:p>
+      <w:pPr>
+        <w:pStyle w:val="ListParagraph"/>
+        <w:numPr>
+          <w:ilvl w:val="0"/>
+          <w:numId w:val="2"/>
+        </w:numPr>
+        <w:spacing w:after="60"/>
+      </w:pPr>
+      <w:r>
+        <w:rPr>
+          <w:b/>
+          <w:bCs/>
+        </w:rPr>
+        <w:t xml:space="preserve">E2E da assistente: </w:t>
+      </w:r>
+      <w:r>
+        <w:t xml:space="preserve">12 verificações: resposta no Telegram e no WebChat, transferência com resumo, saída da IA quando o humano assume, métricas.</w:t>
+      </w:r>
+    </w:p>
+    <w:p>
+      <w:pPr>
+        <w:pStyle w:val="ListParagraph"/>
+        <w:numPr>
+          <w:ilvl w:val="0"/>
+          <w:numId w:val="2"/>
+        </w:numPr>
+        <w:spacing w:after="60"/>
+      </w:pPr>
+      <w:r>
+        <w:rPr>
+          <w:b/>
+          <w:bCs/>
+        </w:rPr>
+        <w:t xml:space="preserve">E2E de interface (Playwright): </w:t>
+      </w:r>
+      <w:r>
+        <w:t xml:space="preserve">16 verificações no navegador, incluindo a configuração do 2FA pela tela e a recuperação após o servidor reiniciar.</w:t>
+      </w:r>
+    </w:p>
+    <w:p>
+      <w:pPr>
+        <w:pStyle w:val="ListParagraph"/>
+        <w:numPr>
+          <w:ilvl w:val="0"/>
+          <w:numId w:val="2"/>
+        </w:numPr>
+        <w:spacing w:after="60"/>
+      </w:pPr>
+      <w:r>
+        <w:rPr>
+          <w:b/>
+          <w:bCs/>
+        </w:rPr>
+        <w:t xml:space="preserve">Avaliação da IA real: </w:t>
+      </w:r>
+      <w:r>
+        <w:t xml:space="preserve">cenários de conversa executados contra o modelo local (4 de 4 com o desfecho esperado).</w:t>
+      </w:r>
+    </w:p>
+    <w:p>
+      <w:pPr>
+        <w:pStyle w:val="ListParagraph"/>
+        <w:numPr>
+          <w:ilvl w:val="0"/>
+          <w:numId w:val="2"/>
+        </w:numPr>
+        <w:spacing w:after="60"/>
+      </w:pPr>
+      <w:r>
+        <w:rPr>
+          <w:b/>
+          <w:bCs/>
+        </w:rPr>
+        <w:t xml:space="preserve">Teste manual com o bot real: </w:t>
+      </w:r>
+      <w:r>
+        <w:t xml:space="preserve">jornada Telegram → atendente → WebChat → telefone executada ponta a ponta (telas reais neste documento).</w:t>
+      </w:r>
+    </w:p>
+    <w:p>
+      <w:pPr>
+        <w:spacing w:before="120"/>
+      </w:pPr>
+      <w:r>
+        <w:t xml:space="preserve">Algumas correções foram feitas com um teste que falhava antes e passava depois (por exemplo, a tela em branco do 2FA e a recuperação após queda de conexão).</w:t>
+      </w:r>
+    </w:p>
+    <w:p>
+      <w:pPr>
+        <w:pStyle w:val="Heading1"/>
+        <w:pageBreakBefore/>
+      </w:pPr>
+      <w:r>
+        <w:t xml:space="preserve">Anexo A — Arquitetura da solução</w:t>
       </w:r>
     </w:p>
     <w:p>
@@ -3642,9 +3592,9 @@
       <w:r>
         <w:drawing>
           <wp:inline distT="0" distB="0" distL="0" distR="0">
-            <wp:extent cx="6096000" cy="2009775"/>
+            <wp:extent cx="6096000" cy="2952750"/>
             <wp:effectExtent t="0" r="0" b="0" l="0"/>
-            <wp:docPr id="24" name="diagrama-fluxo-omnichannel.png" descr="diagrama-fluxo-omnichannel.png" title="diagrama-fluxo-omnichannel.png"/>
+            <wp:docPr id="23" name="diagrama-arquitetura.png" descr="diagrama-arquitetura.png" title="diagrama-arquitetura.png"/>
             <wp:cNvGraphicFramePr>
               <a:graphicFrameLocks xmlns:a="http://schemas.openxmlformats.org/drawingml/2006/main" noChangeAspect="1"/>
             </wp:cNvGraphicFramePr>
@@ -3667,6 +3617,69 @@
                   <pic:spPr bwMode="auto">
                     <a:xfrm>
                       <a:off x="0" y="0"/>
+                      <a:ext cx="6096000" cy="2952750"/>
+                    </a:xfrm>
+                    <a:prstGeom prst="rect">
+                      <a:avLst/>
+                    </a:prstGeom>
+                  </pic:spPr>
+                </pic:pic>
+              </a:graphicData>
+            </a:graphic>
+          </wp:inline>
+        </w:drawing>
+      </w:r>
+    </w:p>
+    <w:p>
+      <w:pPr>
+        <w:spacing w:after="160"/>
+        <w:jc w:val="center"/>
+      </w:pPr>
+      <w:r>
+        <w:rPr>
+          <w:i/>
+          <w:iCs/>
+          <w:color w:val="6B7280"/>
+          <w:sz w:val="18"/>
+          <w:szCs w:val="18"/>
+        </w:rPr>
+        <w:t xml:space="preserve">Componentes: frontends, canais, backend modular e IA local</w:t>
+      </w:r>
+    </w:p>
+    <w:p>
+      <w:pPr>
+        <w:keepNext/>
+        <w:spacing w:after="40"/>
+        <w:jc w:val="center"/>
+      </w:pPr>
+      <w:r>
+        <w:drawing>
+          <wp:inline distT="0" distB="0" distL="0" distR="0">
+            <wp:extent cx="6096000" cy="2009775"/>
+            <wp:effectExtent t="0" r="0" b="0" l="0"/>
+            <wp:docPr id="24" name="diagrama-fluxo-omnichannel.png" descr="diagrama-fluxo-omnichannel.png" title="diagrama-fluxo-omnichannel.png"/>
+            <wp:cNvGraphicFramePr>
+              <a:graphicFrameLocks xmlns:a="http://schemas.openxmlformats.org/drawingml/2006/main" noChangeAspect="1"/>
+            </wp:cNvGraphicFramePr>
+            <a:graphic xmlns:a="http://schemas.openxmlformats.org/drawingml/2006/main">
+              <a:graphicData uri="http://schemas.openxmlformats.org/drawingml/2006/picture">
+                <pic:pic xmlns:pic="http://schemas.openxmlformats.org/drawingml/2006/picture">
+                  <pic:nvPicPr>
+                    <pic:cNvPr id="0" name="" descr=""/>
+                    <pic:cNvPicPr>
+                      <a:picLocks noChangeAspect="1" noChangeArrowheads="1"/>
+                    </pic:cNvPicPr>
+                  </pic:nvPicPr>
+                  <pic:blipFill>
+                    <a:blip r:embed="rId31" cstate="none"/>
+                    <a:srcRect/>
+                    <a:stretch>
+                      <a:fillRect/>
+                    </a:stretch>
+                  </pic:blipFill>
+                  <pic:spPr bwMode="auto">
+                    <a:xfrm>
+                      <a:off x="0" y="0"/>
                       <a:ext cx="6096000" cy="2009775"/>
                     </a:xfrm>
                     <a:prstGeom prst="rect">
@@ -3721,7 +3734,7 @@
                     </pic:cNvPicPr>
                   </pic:nvPicPr>
                   <pic:blipFill>
-                    <a:blip r:embed="rId31" cstate="none"/>
+                    <a:blip r:embed="rId32" cstate="none"/>
                     <a:srcRect/>
                     <a:stretch>
                       <a:fillRect/>

</xml_diff>